<commit_message>
Stage 6 final: 7 figures + GA + S6, 11 citation corrections, IRB placeholder
</commit_message>
<xml_diff>
--- a/tables.docx
+++ b/tables.docx
@@ -1947,7 +1947,7 @@
                 <w:b/>
                 <w:sz w:val="20"/>
               </w:rPr>
-              <w:t>Internal CV</w:t>
+              <w:t>Internal OOB (L2 patient-level bootstrap 95% percentile interval)</w:t>
             </w:r>
           </w:p>
         </w:tc>
@@ -1966,7 +1966,7 @@
                 <w:b/>
                 <w:sz w:val="20"/>
               </w:rPr>
-              <w:t>External C-index (95% CI)</w:t>
+              <w:t>External C-index (95% CI; L1)</w:t>
             </w:r>
           </w:p>
         </w:tc>
@@ -2061,7 +2061,7 @@
                 <w:rFonts w:ascii="Times New Roman" w:hAnsi="Times New Roman"/>
                 <w:sz w:val="20"/>
               </w:rPr>
-              <w:t>0.536 ± 0.028</w:t>
+              <w:t>0.519 (0.476–0.560)</w:t>
             </w:r>
           </w:p>
         </w:tc>
@@ -2171,7 +2171,7 @@
                 <w:rFonts w:ascii="Times New Roman" w:hAnsi="Times New Roman"/>
                 <w:sz w:val="20"/>
               </w:rPr>
-              <w:t>0.575 ± 0.035</w:t>
+              <w:t>0.563 (0.517–0.610)</w:t>
             </w:r>
           </w:p>
         </w:tc>
@@ -2281,7 +2281,7 @@
                 <w:rFonts w:ascii="Times New Roman" w:hAnsi="Times New Roman"/>
                 <w:sz w:val="20"/>
               </w:rPr>
-              <w:t>0.550 ± 0.014</w:t>
+              <w:t>0.574 (0.530–0.617)</w:t>
             </w:r>
           </w:p>
         </w:tc>
@@ -2391,7 +2391,7 @@
                 <w:rFonts w:ascii="Times New Roman" w:hAnsi="Times New Roman"/>
                 <w:sz w:val="20"/>
               </w:rPr>
-              <w:t>0.582 (0.565–0.598)</w:t>
+              <w:t>0.571 (0.523–0.615)</w:t>
             </w:r>
           </w:p>
         </w:tc>

</xml_diff>